<commit_message>
Add latest project documents and remove legacy zip
</commit_message>
<xml_diff>
--- a/project-documents/Fall 2025_CS619_11727_2.docx
+++ b/project-documents/Fall 2025_CS619_11727_2.docx
@@ -1,6 +1,6 @@
 
 <file path=word/document.xml><?xml version="1.0" encoding="utf-8"?>
-<w:document xmlns:wpc="http://schemas.microsoft.com/office/word/2010/wordprocessingCanvas" xmlns:cx="http://schemas.microsoft.com/office/drawing/2014/chartex" xmlns:cx1="http://schemas.microsoft.com/office/drawing/2015/9/8/chartex" xmlns:cx2="http://schemas.microsoft.com/office/drawing/2015/10/21/chartex" xmlns:cx3="http://schemas.microsoft.com/office/drawing/2016/5/9/chartex" xmlns:cx4="http://schemas.microsoft.com/office/drawing/2016/5/10/chartex" xmlns:cx5="http://schemas.microsoft.com/office/drawing/2016/5/11/chartex" xmlns:cx6="http://schemas.microsoft.com/office/drawing/2016/5/12/chartex" xmlns:cx7="http://schemas.microsoft.com/office/drawing/2016/5/13/chartex" xmlns:cx8="http://schemas.microsoft.com/office/drawing/2016/5/14/chartex" xmlns:mc="http://schemas.openxmlformats.org/markup-compatibility/2006" xmlns:aink="http://schemas.microsoft.com/office/drawing/2016/ink" xmlns:am3d="http://schemas.microsoft.com/office/drawing/2017/model3d" xmlns:o="urn:schemas-microsoft-com:office:office" xmlns:r="http://schemas.openxmlformats.org/officeDocument/2006/relationships" xmlns:m="http://schemas.openxmlformats.org/officeDocument/2006/math" xmlns:v="urn:schemas-microsoft-com:vml" xmlns:wp14="http://schemas.microsoft.com/office/word/2010/wordprocessingDrawing" xmlns:wp="http://schemas.openxmlformats.org/drawingml/2006/wordprocessingDrawing" xmlns:w10="urn:schemas-microsoft-com:office:word" xmlns:w="http://schemas.openxmlformats.org/wordprocessingml/2006/main" xmlns:w14="http://schemas.microsoft.com/office/word/2010/wordml" xmlns:w15="http://schemas.microsoft.com/office/word/2012/wordml" xmlns:w16cex="http://schemas.microsoft.com/office/word/2018/wordml/cex" xmlns:w16cid="http://schemas.microsoft.com/office/word/2016/wordml/cid" xmlns:w16="http://schemas.microsoft.com/office/word/2018/wordml" xmlns:w16se="http://schemas.microsoft.com/office/word/2015/wordml/symex" xmlns:wpg="http://schemas.microsoft.com/office/word/2010/wordprocessingGroup" xmlns:wpi="http://schemas.microsoft.com/office/word/2010/wordprocessingInk" xmlns:wne="http://schemas.microsoft.com/office/word/2006/wordml" xmlns:wps="http://schemas.microsoft.com/office/word/2010/wordprocessingShape" mc:Ignorable="w14 w15 w16se w16cid w16 w16cex wp14">
+<w:document xmlns:wpc="http://schemas.microsoft.com/office/word/2010/wordprocessingCanvas" xmlns:cx="http://schemas.microsoft.com/office/drawing/2014/chartex" xmlns:cx1="http://schemas.microsoft.com/office/drawing/2015/9/8/chartex" xmlns:cx2="http://schemas.microsoft.com/office/drawing/2015/10/21/chartex" xmlns:cx3="http://schemas.microsoft.com/office/drawing/2016/5/9/chartex" xmlns:cx4="http://schemas.microsoft.com/office/drawing/2016/5/10/chartex" xmlns:cx5="http://schemas.microsoft.com/office/drawing/2016/5/11/chartex" xmlns:cx6="http://schemas.microsoft.com/office/drawing/2016/5/12/chartex" xmlns:cx7="http://schemas.microsoft.com/office/drawing/2016/5/13/chartex" xmlns:cx8="http://schemas.microsoft.com/office/drawing/2016/5/14/chartex" xmlns:mc="http://schemas.openxmlformats.org/markup-compatibility/2006" xmlns:aink="http://schemas.microsoft.com/office/drawing/2016/ink" xmlns:am3d="http://schemas.microsoft.com/office/drawing/2017/model3d" xmlns:o="urn:schemas-microsoft-com:office:office" xmlns:r="http://schemas.openxmlformats.org/officeDocument/2006/relationships" xmlns:m="http://schemas.openxmlformats.org/officeDocument/2006/math" xmlns:v="urn:schemas-microsoft-com:vml" xmlns:wp14="http://schemas.microsoft.com/office/word/2010/wordprocessingDrawing" xmlns:wp="http://schemas.openxmlformats.org/drawingml/2006/wordprocessingDrawing" xmlns:w10="urn:schemas-microsoft-com:office:word" xmlns:w="http://schemas.openxmlformats.org/wordprocessingml/2006/main" xmlns:w14="http://schemas.microsoft.com/office/word/2010/wordml" xmlns:w15="http://schemas.microsoft.com/office/word/2012/wordml" xmlns:w16cex="http://schemas.microsoft.com/office/word/2018/wordml/cex" xmlns:w16cid="http://schemas.microsoft.com/office/word/2016/wordml/cid" xmlns:w16="http://schemas.microsoft.com/office/word/2018/wordml" xmlns:w16sdtdh="http://schemas.microsoft.com/office/word/2020/wordml/sdtdatahash" xmlns:w16se="http://schemas.microsoft.com/office/word/2015/wordml/symex" xmlns:wpg="http://schemas.microsoft.com/office/word/2010/wordprocessingGroup" xmlns:wpi="http://schemas.microsoft.com/office/word/2010/wordprocessingInk" xmlns:wne="http://schemas.microsoft.com/office/word/2006/wordml" xmlns:wps="http://schemas.microsoft.com/office/word/2010/wordprocessingShape" mc:Ignorable="w14 w15 w16se w16cid w16 w16cex w16sdtdh wp14">
   <w:body>
     <w:p>
       <w:pPr>
@@ -81,33 +81,58 @@
         <w:rPr>
           <w:b/>
           <w:bCs/>
+          <w:noProof/>
           <w:sz w:val="28"/>
           <w:szCs w:val="28"/>
         </w:rPr>
-        <w:pict w14:anchorId="69B00073">
-          <v:shapetype id="_x0000_t75" coordsize="21600,21600" o:spt="75" o:preferrelative="t" path="m@4@5l@4@11@9@11@9@5xe" filled="f" stroked="f">
-            <v:stroke joinstyle="miter"/>
-            <v:formulas>
-              <v:f eqn="if lineDrawn pixelLineWidth 0"/>
-              <v:f eqn="sum @0 1 0"/>
-              <v:f eqn="sum 0 0 @1"/>
-              <v:f eqn="prod @2 1 2"/>
-              <v:f eqn="prod @3 21600 pixelWidth"/>
-              <v:f eqn="prod @3 21600 pixelHeight"/>
-              <v:f eqn="sum @0 0 1"/>
-              <v:f eqn="prod @6 1 2"/>
-              <v:f eqn="prod @7 21600 pixelWidth"/>
-              <v:f eqn="sum @8 21600 0"/>
-              <v:f eqn="prod @7 21600 pixelHeight"/>
-              <v:f eqn="sum @10 21600 0"/>
-            </v:formulas>
-            <v:path o:extrusionok="f" gradientshapeok="t" o:connecttype="rect"/>
-            <o:lock v:ext="edit" aspectratio="t"/>
-          </v:shapetype>
-          <v:shape id="_x0000_i1025" type="#_x0000_t75" style="width:163.8pt;height:108pt">
-            <v:imagedata r:id="rId5" o:title=""/>
-          </v:shape>
-        </w:pict>
+        <w:drawing>
+          <wp:inline distT="0" distB="0" distL="0" distR="0" wp14:anchorId="37CF57DF" wp14:editId="23555952">
+            <wp:extent cx="2082800" cy="1371600"/>
+            <wp:effectExtent l="0" t="0" r="0" b="0"/>
+            <wp:docPr id="11" name="Picture 1"/>
+            <wp:cNvGraphicFramePr>
+              <a:graphicFrameLocks xmlns:a="http://schemas.openxmlformats.org/drawingml/2006/main" noChangeAspect="1"/>
+            </wp:cNvGraphicFramePr>
+            <a:graphic xmlns:a="http://schemas.openxmlformats.org/drawingml/2006/main">
+              <a:graphicData uri="http://schemas.openxmlformats.org/drawingml/2006/picture">
+                <pic:pic xmlns:pic="http://schemas.openxmlformats.org/drawingml/2006/picture">
+                  <pic:nvPicPr>
+                    <pic:cNvPr id="0" name="Picture 1"/>
+                    <pic:cNvPicPr>
+                      <a:picLocks noChangeAspect="1" noChangeArrowheads="1"/>
+                    </pic:cNvPicPr>
+                  </pic:nvPicPr>
+                  <pic:blipFill>
+                    <a:blip r:embed="rId5">
+                      <a:extLst>
+                        <a:ext uri="{28A0092B-C50C-407E-A947-70E740481C1C}">
+                          <a14:useLocalDpi xmlns:a14="http://schemas.microsoft.com/office/drawing/2010/main" val="0"/>
+                        </a:ext>
+                      </a:extLst>
+                    </a:blip>
+                    <a:srcRect/>
+                    <a:stretch>
+                      <a:fillRect/>
+                    </a:stretch>
+                  </pic:blipFill>
+                  <pic:spPr bwMode="auto">
+                    <a:xfrm>
+                      <a:off x="0" y="0"/>
+                      <a:ext cx="2082800" cy="1371600"/>
+                    </a:xfrm>
+                    <a:prstGeom prst="rect">
+                      <a:avLst/>
+                    </a:prstGeom>
+                    <a:noFill/>
+                    <a:ln>
+                      <a:noFill/>
+                    </a:ln>
+                  </pic:spPr>
+                </pic:pic>
+              </a:graphicData>
+            </a:graphic>
+          </wp:inline>
+        </w:drawing>
       </w:r>
     </w:p>
     <w:p>
@@ -247,7 +272,6 @@
           <w:sz w:val="36"/>
           <w:szCs w:val="36"/>
         </w:rPr>
-        <w:lastRenderedPageBreak/>
         <w:t>Revision History</w:t>
       </w:r>
     </w:p>
@@ -423,7 +447,19 @@
           </w:tcPr>
           <w:p>
             <w:r>
-              <w:t>17/11/2025</w:t>
+              <w:t>21</w:t>
+            </w:r>
+            <w:r>
+              <w:t>/</w:t>
+            </w:r>
+            <w:r>
+              <w:t>01</w:t>
+            </w:r>
+            <w:r>
+              <w:t>/202</w:t>
+            </w:r>
+            <w:r>
+              <w:t>6</w:t>
             </w:r>
           </w:p>
         </w:tc>
@@ -856,7 +892,6 @@
           <w:sz w:val="32"/>
           <w:u w:val="single"/>
         </w:rPr>
-        <w:lastRenderedPageBreak/>
         <w:t>Table of Contents</w:t>
       </w:r>
     </w:p>
@@ -1036,49 +1071,7 @@
             <w:rStyle w:val="Hyperlink"/>
             <w:sz w:val="26"/>
           </w:rPr>
-          <w:t>Entity Re</w:t>
-        </w:r>
-        <w:r>
-          <w:rPr>
-            <w:rStyle w:val="Hyperlink"/>
-            <w:sz w:val="26"/>
-          </w:rPr>
-          <w:t>l</w:t>
-        </w:r>
-        <w:r>
-          <w:rPr>
-            <w:rStyle w:val="Hyperlink"/>
-            <w:sz w:val="26"/>
-          </w:rPr>
-          <w:t>ationsh</w:t>
-        </w:r>
-        <w:r>
-          <w:rPr>
-            <w:rStyle w:val="Hyperlink"/>
-            <w:sz w:val="26"/>
-          </w:rPr>
-          <w:t>i</w:t>
-        </w:r>
-        <w:r>
-          <w:rPr>
-            <w:rStyle w:val="Hyperlink"/>
-            <w:sz w:val="26"/>
-          </w:rPr>
-          <w:t xml:space="preserve">p </w:t>
-        </w:r>
-        <w:r>
-          <w:rPr>
-            <w:rStyle w:val="Hyperlink"/>
-            <w:sz w:val="26"/>
-          </w:rPr>
-          <w:t>D</w:t>
-        </w:r>
-        <w:r>
-          <w:rPr>
-            <w:rStyle w:val="Hyperlink"/>
-            <w:sz w:val="26"/>
-          </w:rPr>
-          <w:t>iagram (ERD)</w:t>
+          <w:t>Entity Relationship Diagram (ERD)</w:t>
         </w:r>
       </w:hyperlink>
     </w:p>
@@ -1100,35 +1093,7 @@
             <w:rStyle w:val="Hyperlink"/>
             <w:sz w:val="26"/>
           </w:rPr>
-          <w:t>Sequenc</w:t>
-        </w:r>
-        <w:r>
-          <w:rPr>
-            <w:rStyle w:val="Hyperlink"/>
-            <w:sz w:val="26"/>
-          </w:rPr>
-          <w:t>e</w:t>
-        </w:r>
-        <w:r>
-          <w:rPr>
-            <w:rStyle w:val="Hyperlink"/>
-            <w:sz w:val="26"/>
-          </w:rPr>
-          <w:t xml:space="preserve"> Dia</w:t>
-        </w:r>
-        <w:r>
-          <w:rPr>
-            <w:rStyle w:val="Hyperlink"/>
-            <w:sz w:val="26"/>
-          </w:rPr>
-          <w:t>g</w:t>
-        </w:r>
-        <w:r>
-          <w:rPr>
-            <w:rStyle w:val="Hyperlink"/>
-            <w:sz w:val="26"/>
-          </w:rPr>
-          <w:t>rams</w:t>
+          <w:t>Sequence Diagrams</w:t>
         </w:r>
       </w:hyperlink>
       <w:r>
@@ -1157,21 +1122,7 @@
             <w:rStyle w:val="Hyperlink"/>
             <w:sz w:val="26"/>
           </w:rPr>
-          <w:t>Architect</w:t>
-        </w:r>
-        <w:r>
-          <w:rPr>
-            <w:rStyle w:val="Hyperlink"/>
-            <w:sz w:val="26"/>
-          </w:rPr>
-          <w:t>u</w:t>
-        </w:r>
-        <w:r>
-          <w:rPr>
-            <w:rStyle w:val="Hyperlink"/>
-            <w:sz w:val="26"/>
-          </w:rPr>
-          <w:t>re Design Diagram</w:t>
+          <w:t>Architecture Design Diagram</w:t>
         </w:r>
       </w:hyperlink>
       <w:r>
@@ -1203,19 +1154,7 @@
           <w:rPr>
             <w:rStyle w:val="Hyperlink"/>
           </w:rPr>
-          <w:t>Class Di</w:t>
-        </w:r>
-        <w:r>
-          <w:rPr>
-            <w:rStyle w:val="Hyperlink"/>
-          </w:rPr>
-          <w:t>a</w:t>
-        </w:r>
-        <w:r>
-          <w:rPr>
-            <w:rStyle w:val="Hyperlink"/>
-          </w:rPr>
-          <w:t>gram</w:t>
+          <w:t>Class Diagram</w:t>
         </w:r>
         <w:r>
           <w:rPr>
@@ -1253,31 +1192,7 @@
           <w:rPr>
             <w:rStyle w:val="Hyperlink"/>
           </w:rPr>
-          <w:t xml:space="preserve">Database </w:t>
-        </w:r>
-        <w:r>
-          <w:rPr>
-            <w:rStyle w:val="Hyperlink"/>
-          </w:rPr>
-          <w:t>D</w:t>
-        </w:r>
-        <w:r>
-          <w:rPr>
-            <w:rStyle w:val="Hyperlink"/>
-          </w:rPr>
-          <w:t>e</w:t>
-        </w:r>
-        <w:r>
-          <w:rPr>
-            <w:rStyle w:val="Hyperlink"/>
-          </w:rPr>
-          <w:t>s</w:t>
-        </w:r>
-        <w:r>
-          <w:rPr>
-            <w:rStyle w:val="Hyperlink"/>
-          </w:rPr>
-          <w:t>ign</w:t>
+          <w:t>Database Design</w:t>
         </w:r>
       </w:hyperlink>
     </w:p>
@@ -1297,19 +1212,7 @@
           <w:rPr>
             <w:rStyle w:val="Hyperlink"/>
           </w:rPr>
-          <w:t>Interface D</w:t>
-        </w:r>
-        <w:r>
-          <w:rPr>
-            <w:rStyle w:val="Hyperlink"/>
-          </w:rPr>
-          <w:t>e</w:t>
-        </w:r>
-        <w:r>
-          <w:rPr>
-            <w:rStyle w:val="Hyperlink"/>
-          </w:rPr>
-          <w:t>sign</w:t>
+          <w:t>Interface Design</w:t>
         </w:r>
       </w:hyperlink>
     </w:p>
@@ -1326,31 +1229,7 @@
           <w:rPr>
             <w:rStyle w:val="Hyperlink"/>
           </w:rPr>
-          <w:t xml:space="preserve">Test </w:t>
-        </w:r>
-        <w:r>
-          <w:rPr>
-            <w:rStyle w:val="Hyperlink"/>
-          </w:rPr>
-          <w:t>C</w:t>
-        </w:r>
-        <w:r>
-          <w:rPr>
-            <w:rStyle w:val="Hyperlink"/>
-          </w:rPr>
-          <w:t>a</w:t>
-        </w:r>
-        <w:r>
-          <w:rPr>
-            <w:rStyle w:val="Hyperlink"/>
-          </w:rPr>
-          <w:t>s</w:t>
-        </w:r>
-        <w:r>
-          <w:rPr>
-            <w:rStyle w:val="Hyperlink"/>
-          </w:rPr>
-          <w:t>es</w:t>
+          <w:t>Test Cases</w:t>
         </w:r>
       </w:hyperlink>
       <w:r>
@@ -1527,7 +1406,6 @@
           <w:szCs w:val="28"/>
           <w:u w:val="single"/>
         </w:rPr>
-        <w:lastRenderedPageBreak/>
         <w:t xml:space="preserve">Introduction </w:t>
       </w:r>
       <w:r>
@@ -1672,22 +1550,27 @@
     </w:p>
     <w:p>
       <w:r>
+        <w:rPr>
+          <w:noProof/>
+        </w:rPr>
+        <w:lastRenderedPageBreak/>
         <w:drawing>
-          <wp:inline xmlns:a="http://schemas.openxmlformats.org/drawingml/2006/main" xmlns:pic="http://schemas.openxmlformats.org/drawingml/2006/picture">
+          <wp:inline distT="0" distB="0" distL="0" distR="0" wp14:anchorId="286AC900" wp14:editId="23ADC750">
             <wp:extent cx="6217920" cy="3799840"/>
+            <wp:effectExtent l="0" t="0" r="0" b="0"/>
             <wp:docPr id="1" name="Picture 1"/>
             <wp:cNvGraphicFramePr>
-              <a:graphicFrameLocks noChangeAspect="1"/>
+              <a:graphicFrameLocks xmlns:a="http://schemas.openxmlformats.org/drawingml/2006/main" noChangeAspect="1"/>
             </wp:cNvGraphicFramePr>
-            <a:graphic>
+            <a:graphic xmlns:a="http://schemas.openxmlformats.org/drawingml/2006/main">
               <a:graphicData uri="http://schemas.openxmlformats.org/drawingml/2006/picture">
-                <pic:pic>
+                <pic:pic xmlns:pic="http://schemas.openxmlformats.org/drawingml/2006/picture">
                   <pic:nvPicPr>
                     <pic:cNvPr id="0" name="image.png"/>
                     <pic:cNvPicPr/>
                   </pic:nvPicPr>
                   <pic:blipFill>
-                    <a:blip r:embed="rId18"/>
+                    <a:blip r:embed="rId6"/>
                     <a:stretch>
                       <a:fillRect/>
                     </a:stretch>
@@ -1697,7 +1580,9 @@
                       <a:off x="0" y="0"/>
                       <a:ext cx="6217920" cy="3799840"/>
                     </a:xfrm>
-                    <a:prstGeom prst="rect"/>
+                    <a:prstGeom prst="rect">
+                      <a:avLst/>
+                    </a:prstGeom>
                   </pic:spPr>
                 </pic:pic>
               </a:graphicData>
@@ -1787,22 +1672,27 @@
     </w:p>
     <w:p>
       <w:r>
+        <w:rPr>
+          <w:noProof/>
+        </w:rPr>
+        <w:lastRenderedPageBreak/>
         <w:drawing>
-          <wp:inline xmlns:a="http://schemas.openxmlformats.org/drawingml/2006/main" xmlns:pic="http://schemas.openxmlformats.org/drawingml/2006/picture">
+          <wp:inline distT="0" distB="0" distL="0" distR="0" wp14:anchorId="5CC41862" wp14:editId="69E85D03">
             <wp:extent cx="6217920" cy="5625737"/>
+            <wp:effectExtent l="0" t="0" r="0" b="0"/>
             <wp:docPr id="2" name="Picture 2"/>
             <wp:cNvGraphicFramePr>
-              <a:graphicFrameLocks noChangeAspect="1"/>
+              <a:graphicFrameLocks xmlns:a="http://schemas.openxmlformats.org/drawingml/2006/main" noChangeAspect="1"/>
             </wp:cNvGraphicFramePr>
-            <a:graphic>
+            <a:graphic xmlns:a="http://schemas.openxmlformats.org/drawingml/2006/main">
               <a:graphicData uri="http://schemas.openxmlformats.org/drawingml/2006/picture">
-                <pic:pic>
+                <pic:pic xmlns:pic="http://schemas.openxmlformats.org/drawingml/2006/picture">
                   <pic:nvPicPr>
                     <pic:cNvPr id="0" name="image.png"/>
                     <pic:cNvPicPr/>
                   </pic:nvPicPr>
                   <pic:blipFill>
-                    <a:blip r:embed="rId31"/>
+                    <a:blip r:embed="rId7"/>
                     <a:stretch>
                       <a:fillRect/>
                     </a:stretch>
@@ -1812,7 +1702,9 @@
                       <a:off x="0" y="0"/>
                       <a:ext cx="6217920" cy="5625737"/>
                     </a:xfrm>
-                    <a:prstGeom prst="rect"/>
+                    <a:prstGeom prst="rect">
+                      <a:avLst/>
+                    </a:prstGeom>
                   </pic:spPr>
                 </pic:pic>
               </a:graphicData>
@@ -1846,22 +1738,27 @@
     </w:p>
     <w:p>
       <w:r>
+        <w:rPr>
+          <w:noProof/>
+        </w:rPr>
+        <w:lastRenderedPageBreak/>
         <w:drawing>
-          <wp:inline xmlns:a="http://schemas.openxmlformats.org/drawingml/2006/main" xmlns:pic="http://schemas.openxmlformats.org/drawingml/2006/picture">
+          <wp:inline distT="0" distB="0" distL="0" distR="0" wp14:anchorId="12452E22" wp14:editId="0307935D">
             <wp:extent cx="6217920" cy="5625737"/>
+            <wp:effectExtent l="0" t="0" r="0" b="0"/>
             <wp:docPr id="3" name="Picture 3"/>
             <wp:cNvGraphicFramePr>
-              <a:graphicFrameLocks noChangeAspect="1"/>
+              <a:graphicFrameLocks xmlns:a="http://schemas.openxmlformats.org/drawingml/2006/main" noChangeAspect="1"/>
             </wp:cNvGraphicFramePr>
-            <a:graphic>
+            <a:graphic xmlns:a="http://schemas.openxmlformats.org/drawingml/2006/main">
               <a:graphicData uri="http://schemas.openxmlformats.org/drawingml/2006/picture">
-                <pic:pic>
+                <pic:pic xmlns:pic="http://schemas.openxmlformats.org/drawingml/2006/picture">
                   <pic:nvPicPr>
                     <pic:cNvPr id="0" name="image.png"/>
                     <pic:cNvPicPr/>
                   </pic:nvPicPr>
                   <pic:blipFill>
-                    <a:blip r:embed="rId32"/>
+                    <a:blip r:embed="rId8"/>
                     <a:stretch>
                       <a:fillRect/>
                     </a:stretch>
@@ -1871,7 +1768,9 @@
                       <a:off x="0" y="0"/>
                       <a:ext cx="6217920" cy="5625737"/>
                     </a:xfrm>
-                    <a:prstGeom prst="rect"/>
+                    <a:prstGeom prst="rect">
+                      <a:avLst/>
+                    </a:prstGeom>
                   </pic:spPr>
                 </pic:pic>
               </a:graphicData>
@@ -1905,22 +1804,27 @@
     </w:p>
     <w:p>
       <w:r>
+        <w:rPr>
+          <w:noProof/>
+        </w:rPr>
+        <w:lastRenderedPageBreak/>
         <w:drawing>
-          <wp:inline xmlns:a="http://schemas.openxmlformats.org/drawingml/2006/main" xmlns:pic="http://schemas.openxmlformats.org/drawingml/2006/picture">
+          <wp:inline distT="0" distB="0" distL="0" distR="0" wp14:anchorId="54AD156D" wp14:editId="0F1BCABF">
             <wp:extent cx="6217920" cy="5625737"/>
+            <wp:effectExtent l="0" t="0" r="0" b="0"/>
             <wp:docPr id="4" name="Picture 4"/>
             <wp:cNvGraphicFramePr>
-              <a:graphicFrameLocks noChangeAspect="1"/>
+              <a:graphicFrameLocks xmlns:a="http://schemas.openxmlformats.org/drawingml/2006/main" noChangeAspect="1"/>
             </wp:cNvGraphicFramePr>
-            <a:graphic>
+            <a:graphic xmlns:a="http://schemas.openxmlformats.org/drawingml/2006/main">
               <a:graphicData uri="http://schemas.openxmlformats.org/drawingml/2006/picture">
-                <pic:pic>
+                <pic:pic xmlns:pic="http://schemas.openxmlformats.org/drawingml/2006/picture">
                   <pic:nvPicPr>
                     <pic:cNvPr id="0" name="image.png"/>
                     <pic:cNvPicPr/>
                   </pic:nvPicPr>
                   <pic:blipFill>
-                    <a:blip r:embed="rId33"/>
+                    <a:blip r:embed="rId9"/>
                     <a:stretch>
                       <a:fillRect/>
                     </a:stretch>
@@ -1930,7 +1834,9 @@
                       <a:off x="0" y="0"/>
                       <a:ext cx="6217920" cy="5625737"/>
                     </a:xfrm>
-                    <a:prstGeom prst="rect"/>
+                    <a:prstGeom prst="rect">
+                      <a:avLst/>
+                    </a:prstGeom>
                   </pic:spPr>
                 </pic:pic>
               </a:graphicData>
@@ -1991,27 +1897,32 @@
     </w:p>
     <w:p>
       <w:r>
+        <w:lastRenderedPageBreak/>
         <w:t>Cross-cutting concerns such as configuration, error handling, and logging flow through extensions.py and config.py ensuring consistency across tiers.</w:t>
       </w:r>
     </w:p>
     <w:p>
       <w:r>
+        <w:rPr>
+          <w:noProof/>
+        </w:rPr>
         <w:drawing>
-          <wp:inline xmlns:a="http://schemas.openxmlformats.org/drawingml/2006/main" xmlns:pic="http://schemas.openxmlformats.org/drawingml/2006/picture">
+          <wp:inline distT="0" distB="0" distL="0" distR="0" wp14:anchorId="383DCB31" wp14:editId="35A8ED6B">
             <wp:extent cx="6217920" cy="4533900"/>
+            <wp:effectExtent l="0" t="0" r="0" b="0"/>
             <wp:docPr id="5" name="Picture 5"/>
             <wp:cNvGraphicFramePr>
-              <a:graphicFrameLocks noChangeAspect="1"/>
+              <a:graphicFrameLocks xmlns:a="http://schemas.openxmlformats.org/drawingml/2006/main" noChangeAspect="1"/>
             </wp:cNvGraphicFramePr>
-            <a:graphic>
+            <a:graphic xmlns:a="http://schemas.openxmlformats.org/drawingml/2006/main">
               <a:graphicData uri="http://schemas.openxmlformats.org/drawingml/2006/picture">
-                <pic:pic>
+                <pic:pic xmlns:pic="http://schemas.openxmlformats.org/drawingml/2006/picture">
                   <pic:nvPicPr>
                     <pic:cNvPr id="0" name="architecture.png"/>
                     <pic:cNvPicPr/>
                   </pic:nvPicPr>
                   <pic:blipFill>
-                    <a:blip r:embed="rId42"/>
+                    <a:blip r:embed="rId10"/>
                     <a:stretch>
                       <a:fillRect/>
                     </a:stretch>
@@ -2021,7 +1932,9 @@
                       <a:off x="0" y="0"/>
                       <a:ext cx="6217920" cy="4533900"/>
                     </a:xfrm>
-                    <a:prstGeom prst="rect"/>
+                    <a:prstGeom prst="rect">
+                      <a:avLst/>
+                    </a:prstGeom>
                   </pic:spPr>
                 </pic:pic>
               </a:graphicData>
@@ -2107,22 +2020,27 @@
     </w:p>
     <w:p>
       <w:r>
+        <w:rPr>
+          <w:noProof/>
+        </w:rPr>
+        <w:lastRenderedPageBreak/>
         <w:drawing>
-          <wp:inline xmlns:a="http://schemas.openxmlformats.org/drawingml/2006/main" xmlns:pic="http://schemas.openxmlformats.org/drawingml/2006/picture">
+          <wp:inline distT="0" distB="0" distL="0" distR="0" wp14:anchorId="2CA8FAD0" wp14:editId="69AAC857">
             <wp:extent cx="6217920" cy="5720486"/>
+            <wp:effectExtent l="0" t="0" r="0" b="0"/>
             <wp:docPr id="6" name="Picture 6"/>
             <wp:cNvGraphicFramePr>
-              <a:graphicFrameLocks noChangeAspect="1"/>
+              <a:graphicFrameLocks xmlns:a="http://schemas.openxmlformats.org/drawingml/2006/main" noChangeAspect="1"/>
             </wp:cNvGraphicFramePr>
-            <a:graphic>
+            <a:graphic xmlns:a="http://schemas.openxmlformats.org/drawingml/2006/main">
               <a:graphicData uri="http://schemas.openxmlformats.org/drawingml/2006/picture">
-                <pic:pic>
+                <pic:pic xmlns:pic="http://schemas.openxmlformats.org/drawingml/2006/picture">
                   <pic:nvPicPr>
                     <pic:cNvPr id="0" name="image.png"/>
                     <pic:cNvPicPr/>
                   </pic:nvPicPr>
                   <pic:blipFill>
-                    <a:blip r:embed="rId39"/>
+                    <a:blip r:embed="rId11"/>
                     <a:stretch>
                       <a:fillRect/>
                     </a:stretch>
@@ -2132,7 +2050,9 @@
                       <a:off x="0" y="0"/>
                       <a:ext cx="6217920" cy="5720486"/>
                     </a:xfrm>
-                    <a:prstGeom prst="rect"/>
+                    <a:prstGeom prst="rect">
+                      <a:avLst/>
+                    </a:prstGeom>
                   </pic:spPr>
                 </pic:pic>
               </a:graphicData>
@@ -2216,6 +2136,7 @@
     </w:p>
     <w:p>
       <w:r>
+        <w:lastRenderedPageBreak/>
         <w:t>Indexes: saved_recommendations.session_id (BTREE) for dashboard speed; future indexes planned on created_at for archival policies.</w:t>
       </w:r>
     </w:p>
@@ -2226,22 +2147,26 @@
     </w:p>
     <w:p>
       <w:r>
+        <w:rPr>
+          <w:noProof/>
+        </w:rPr>
         <w:drawing>
-          <wp:inline xmlns:a="http://schemas.openxmlformats.org/drawingml/2006/main" xmlns:pic="http://schemas.openxmlformats.org/drawingml/2006/picture">
+          <wp:inline distT="0" distB="0" distL="0" distR="0" wp14:anchorId="57D49615" wp14:editId="118E93BA">
             <wp:extent cx="6217920" cy="4737463"/>
+            <wp:effectExtent l="0" t="0" r="0" b="0"/>
             <wp:docPr id="7" name="Picture 7"/>
             <wp:cNvGraphicFramePr>
-              <a:graphicFrameLocks noChangeAspect="1"/>
+              <a:graphicFrameLocks xmlns:a="http://schemas.openxmlformats.org/drawingml/2006/main" noChangeAspect="1"/>
             </wp:cNvGraphicFramePr>
-            <a:graphic>
+            <a:graphic xmlns:a="http://schemas.openxmlformats.org/drawingml/2006/main">
               <a:graphicData uri="http://schemas.openxmlformats.org/drawingml/2006/picture">
-                <pic:pic>
+                <pic:pic xmlns:pic="http://schemas.openxmlformats.org/drawingml/2006/picture">
                   <pic:nvPicPr>
                     <pic:cNvPr id="0" name="image.png"/>
                     <pic:cNvPicPr/>
                   </pic:nvPicPr>
                   <pic:blipFill>
-                    <a:blip r:embed="rId40"/>
+                    <a:blip r:embed="rId12"/>
                     <a:stretch>
                       <a:fillRect/>
                     </a:stretch>
@@ -2251,7 +2176,9 @@
                       <a:off x="0" y="0"/>
                       <a:ext cx="6217920" cy="4737463"/>
                     </a:xfrm>
-                    <a:prstGeom prst="rect"/>
+                    <a:prstGeom prst="rect">
+                      <a:avLst/>
+                    </a:prstGeom>
                   </pic:spPr>
                 </pic:pic>
               </a:graphicData>
@@ -2341,22 +2268,27 @@
     </w:p>
     <w:p>
       <w:r>
+        <w:rPr>
+          <w:noProof/>
+        </w:rPr>
+        <w:lastRenderedPageBreak/>
         <w:drawing>
-          <wp:inline xmlns:a="http://schemas.openxmlformats.org/drawingml/2006/main" xmlns:pic="http://schemas.openxmlformats.org/drawingml/2006/picture">
+          <wp:inline distT="0" distB="0" distL="0" distR="0" wp14:anchorId="25C5EFDC" wp14:editId="358F819F">
             <wp:extent cx="6217920" cy="3886200"/>
+            <wp:effectExtent l="0" t="0" r="0" b="0"/>
             <wp:docPr id="8" name="Picture 8"/>
             <wp:cNvGraphicFramePr>
-              <a:graphicFrameLocks noChangeAspect="1"/>
+              <a:graphicFrameLocks xmlns:a="http://schemas.openxmlformats.org/drawingml/2006/main" noChangeAspect="1"/>
             </wp:cNvGraphicFramePr>
-            <a:graphic>
+            <a:graphic xmlns:a="http://schemas.openxmlformats.org/drawingml/2006/main">
               <a:graphicData uri="http://schemas.openxmlformats.org/drawingml/2006/picture">
-                <pic:pic>
+                <pic:pic xmlns:pic="http://schemas.openxmlformats.org/drawingml/2006/picture">
                   <pic:nvPicPr>
                     <pic:cNvPr id="0" name="image.png"/>
                     <pic:cNvPicPr/>
                   </pic:nvPicPr>
                   <pic:blipFill>
-                    <a:blip r:embed="rId25"/>
+                    <a:blip r:embed="rId13"/>
                     <a:stretch>
                       <a:fillRect/>
                     </a:stretch>
@@ -2366,7 +2298,9 @@
                       <a:off x="0" y="0"/>
                       <a:ext cx="6217920" cy="3886200"/>
                     </a:xfrm>
-                    <a:prstGeom prst="rect"/>
+                    <a:prstGeom prst="rect">
+                      <a:avLst/>
+                    </a:prstGeom>
                   </pic:spPr>
                 </pic:pic>
               </a:graphicData>
@@ -2385,22 +2319,26 @@
     </w:p>
     <w:p>
       <w:r>
+        <w:rPr>
+          <w:noProof/>
+        </w:rPr>
         <w:drawing>
-          <wp:inline xmlns:a="http://schemas.openxmlformats.org/drawingml/2006/main" xmlns:pic="http://schemas.openxmlformats.org/drawingml/2006/picture">
+          <wp:inline distT="0" distB="0" distL="0" distR="0" wp14:anchorId="5D6C7B2A" wp14:editId="25BDE243">
             <wp:extent cx="6217920" cy="3886200"/>
+            <wp:effectExtent l="0" t="0" r="0" b="0"/>
             <wp:docPr id="9" name="Picture 9"/>
             <wp:cNvGraphicFramePr>
-              <a:graphicFrameLocks noChangeAspect="1"/>
+              <a:graphicFrameLocks xmlns:a="http://schemas.openxmlformats.org/drawingml/2006/main" noChangeAspect="1"/>
             </wp:cNvGraphicFramePr>
-            <a:graphic>
+            <a:graphic xmlns:a="http://schemas.openxmlformats.org/drawingml/2006/main">
               <a:graphicData uri="http://schemas.openxmlformats.org/drawingml/2006/picture">
-                <pic:pic>
+                <pic:pic xmlns:pic="http://schemas.openxmlformats.org/drawingml/2006/picture">
                   <pic:nvPicPr>
                     <pic:cNvPr id="0" name="image.png"/>
                     <pic:cNvPicPr/>
                   </pic:nvPicPr>
                   <pic:blipFill>
-                    <a:blip r:embed="rId26"/>
+                    <a:blip r:embed="rId14"/>
                     <a:stretch>
                       <a:fillRect/>
                     </a:stretch>
@@ -2410,7 +2348,9 @@
                       <a:off x="0" y="0"/>
                       <a:ext cx="6217920" cy="3886200"/>
                     </a:xfrm>
-                    <a:prstGeom prst="rect"/>
+                    <a:prstGeom prst="rect">
+                      <a:avLst/>
+                    </a:prstGeom>
                   </pic:spPr>
                 </pic:pic>
               </a:graphicData>
@@ -2429,22 +2369,27 @@
     </w:p>
     <w:p>
       <w:r>
+        <w:rPr>
+          <w:noProof/>
+        </w:rPr>
+        <w:lastRenderedPageBreak/>
         <w:drawing>
-          <wp:inline xmlns:a="http://schemas.openxmlformats.org/drawingml/2006/main" xmlns:pic="http://schemas.openxmlformats.org/drawingml/2006/picture">
+          <wp:inline distT="0" distB="0" distL="0" distR="0" wp14:anchorId="009DDC51" wp14:editId="4319B6D7">
             <wp:extent cx="6217920" cy="3886200"/>
+            <wp:effectExtent l="0" t="0" r="0" b="0"/>
             <wp:docPr id="10" name="Picture 10"/>
             <wp:cNvGraphicFramePr>
-              <a:graphicFrameLocks noChangeAspect="1"/>
+              <a:graphicFrameLocks xmlns:a="http://schemas.openxmlformats.org/drawingml/2006/main" noChangeAspect="1"/>
             </wp:cNvGraphicFramePr>
-            <a:graphic>
+            <a:graphic xmlns:a="http://schemas.openxmlformats.org/drawingml/2006/main">
               <a:graphicData uri="http://schemas.openxmlformats.org/drawingml/2006/picture">
-                <pic:pic>
+                <pic:pic xmlns:pic="http://schemas.openxmlformats.org/drawingml/2006/picture">
                   <pic:nvPicPr>
                     <pic:cNvPr id="0" name="image.png"/>
                     <pic:cNvPicPr/>
                   </pic:nvPicPr>
                   <pic:blipFill>
-                    <a:blip r:embed="rId27"/>
+                    <a:blip r:embed="rId15"/>
                     <a:stretch>
                       <a:fillRect/>
                     </a:stretch>
@@ -2454,7 +2399,9 @@
                       <a:off x="0" y="0"/>
                       <a:ext cx="6217920" cy="3886200"/>
                     </a:xfrm>
-                    <a:prstGeom prst="rect"/>
+                    <a:prstGeom prst="rect">
+                      <a:avLst/>
+                    </a:prstGeom>
                   </pic:spPr>
                 </pic:pic>
               </a:graphicData>
@@ -2506,22 +2453,22 @@
     <w:p/>
     <w:tbl>
       <w:tblPr>
-        <w:tblW w:type="auto" w:w="0"/>
-        <w:tblLook w:firstColumn="1" w:firstRow="1" w:lastColumn="0" w:lastRow="0" w:noHBand="0" w:noVBand="1" w:val="04A0"/>
+        <w:tblW w:w="0" w:type="auto"/>
+        <w:tblLook w:val="04A0" w:firstRow="1" w:lastRow="0" w:firstColumn="1" w:lastColumn="0" w:noHBand="0" w:noVBand="1"/>
       </w:tblPr>
       <w:tblGrid>
-        <w:gridCol w:w="1389"/>
-        <w:gridCol w:w="1389"/>
-        <w:gridCol w:w="1389"/>
-        <w:gridCol w:w="1389"/>
-        <w:gridCol w:w="1389"/>
-        <w:gridCol w:w="1389"/>
-        <w:gridCol w:w="1389"/>
+        <w:gridCol w:w="566"/>
+        <w:gridCol w:w="767"/>
+        <w:gridCol w:w="1473"/>
+        <w:gridCol w:w="1428"/>
+        <w:gridCol w:w="2690"/>
+        <w:gridCol w:w="1999"/>
+        <w:gridCol w:w="797"/>
       </w:tblGrid>
       <w:tr>
         <w:tc>
           <w:tcPr>
-            <w:tcW w:type="dxa" w:w="1389"/>
+            <w:tcW w:w="1389" w:type="dxa"/>
           </w:tcPr>
           <w:p>
             <w:r>
@@ -2531,7 +2478,7 @@
         </w:tc>
         <w:tc>
           <w:tcPr>
-            <w:tcW w:type="dxa" w:w="1389"/>
+            <w:tcW w:w="1389" w:type="dxa"/>
           </w:tcPr>
           <w:p>
             <w:r>
@@ -2541,7 +2488,7 @@
         </w:tc>
         <w:tc>
           <w:tcPr>
-            <w:tcW w:type="dxa" w:w="1389"/>
+            <w:tcW w:w="1389" w:type="dxa"/>
           </w:tcPr>
           <w:p>
             <w:r>
@@ -2551,7 +2498,7 @@
         </w:tc>
         <w:tc>
           <w:tcPr>
-            <w:tcW w:type="dxa" w:w="1389"/>
+            <w:tcW w:w="1389" w:type="dxa"/>
           </w:tcPr>
           <w:p>
             <w:r>
@@ -2561,7 +2508,7 @@
         </w:tc>
         <w:tc>
           <w:tcPr>
-            <w:tcW w:type="dxa" w:w="1389"/>
+            <w:tcW w:w="1389" w:type="dxa"/>
           </w:tcPr>
           <w:p>
             <w:r>
@@ -2571,7 +2518,7 @@
         </w:tc>
         <w:tc>
           <w:tcPr>
-            <w:tcW w:type="dxa" w:w="1389"/>
+            <w:tcW w:w="1389" w:type="dxa"/>
           </w:tcPr>
           <w:p>
             <w:r>
@@ -2581,7 +2528,7 @@
         </w:tc>
         <w:tc>
           <w:tcPr>
-            <w:tcW w:type="dxa" w:w="1389"/>
+            <w:tcW w:w="1389" w:type="dxa"/>
           </w:tcPr>
           <w:p>
             <w:r>
@@ -2593,7 +2540,7 @@
       <w:tr>
         <w:tc>
           <w:tcPr>
-            <w:tcW w:type="dxa" w:w="1389"/>
+            <w:tcW w:w="1389" w:type="dxa"/>
           </w:tcPr>
           <w:p>
             <w:r>
@@ -2603,7 +2550,7 @@
         </w:tc>
         <w:tc>
           <w:tcPr>
-            <w:tcW w:type="dxa" w:w="1389"/>
+            <w:tcW w:w="1389" w:type="dxa"/>
           </w:tcPr>
           <w:p>
             <w:r>
@@ -2613,7 +2560,7 @@
         </w:tc>
         <w:tc>
           <w:tcPr>
-            <w:tcW w:type="dxa" w:w="1389"/>
+            <w:tcW w:w="1389" w:type="dxa"/>
           </w:tcPr>
           <w:p>
             <w:r>
@@ -2623,7 +2570,7 @@
         </w:tc>
         <w:tc>
           <w:tcPr>
-            <w:tcW w:type="dxa" w:w="1389"/>
+            <w:tcW w:w="1389" w:type="dxa"/>
           </w:tcPr>
           <w:p>
             <w:r>
@@ -2633,11 +2580,13 @@
         </w:tc>
         <w:tc>
           <w:tcPr>
-            <w:tcW w:type="dxa" w:w="1389"/>
+            <w:tcW w:w="1389" w:type="dxa"/>
           </w:tcPr>
           <w:p>
             <w:r>
               <w:t>1. POST /api/recommend with valid preference and model=hybrid.</w:t>
+            </w:r>
+            <w:r>
               <w:br/>
               <w:t>2. Observe response.</w:t>
             </w:r>
@@ -2645,7 +2594,7 @@
         </w:tc>
         <w:tc>
           <w:tcPr>
-            <w:tcW w:type="dxa" w:w="1389"/>
+            <w:tcW w:w="1389" w:type="dxa"/>
           </w:tcPr>
           <w:p>
             <w:r>
@@ -2655,7 +2604,7 @@
         </w:tc>
         <w:tc>
           <w:tcPr>
-            <w:tcW w:type="dxa" w:w="1389"/>
+            <w:tcW w:w="1389" w:type="dxa"/>
           </w:tcPr>
           <w:p>
             <w:r>
@@ -2667,7 +2616,7 @@
       <w:tr>
         <w:tc>
           <w:tcPr>
-            <w:tcW w:type="dxa" w:w="1389"/>
+            <w:tcW w:w="1389" w:type="dxa"/>
           </w:tcPr>
           <w:p>
             <w:r>
@@ -2677,7 +2626,7 @@
         </w:tc>
         <w:tc>
           <w:tcPr>
-            <w:tcW w:type="dxa" w:w="1389"/>
+            <w:tcW w:w="1389" w:type="dxa"/>
           </w:tcPr>
           <w:p>
             <w:r>
@@ -2687,7 +2636,7 @@
         </w:tc>
         <w:tc>
           <w:tcPr>
-            <w:tcW w:type="dxa" w:w="1389"/>
+            <w:tcW w:w="1389" w:type="dxa"/>
           </w:tcPr>
           <w:p>
             <w:r>
@@ -2697,7 +2646,7 @@
         </w:tc>
         <w:tc>
           <w:tcPr>
-            <w:tcW w:type="dxa" w:w="1389"/>
+            <w:tcW w:w="1389" w:type="dxa"/>
           </w:tcPr>
           <w:p>
             <w:r>
@@ -2707,11 +2656,13 @@
         </w:tc>
         <w:tc>
           <w:tcPr>
-            <w:tcW w:type="dxa" w:w="1389"/>
+            <w:tcW w:w="1389" w:type="dxa"/>
           </w:tcPr>
           <w:p>
             <w:r>
               <w:t>1. POST /api/recommend with preference="".</w:t>
+            </w:r>
+            <w:r>
               <w:br/>
               <w:t>2. Observe response.</w:t>
             </w:r>
@@ -2719,7 +2670,7 @@
         </w:tc>
         <w:tc>
           <w:tcPr>
-            <w:tcW w:type="dxa" w:w="1389"/>
+            <w:tcW w:w="1389" w:type="dxa"/>
           </w:tcPr>
           <w:p>
             <w:r>
@@ -2729,7 +2680,7 @@
         </w:tc>
         <w:tc>
           <w:tcPr>
-            <w:tcW w:type="dxa" w:w="1389"/>
+            <w:tcW w:w="1389" w:type="dxa"/>
           </w:tcPr>
           <w:p>
             <w:r>
@@ -2741,7 +2692,7 @@
       <w:tr>
         <w:tc>
           <w:tcPr>
-            <w:tcW w:type="dxa" w:w="1389"/>
+            <w:tcW w:w="1389" w:type="dxa"/>
           </w:tcPr>
           <w:p>
             <w:r>
@@ -2751,7 +2702,7 @@
         </w:tc>
         <w:tc>
           <w:tcPr>
-            <w:tcW w:type="dxa" w:w="1389"/>
+            <w:tcW w:w="1389" w:type="dxa"/>
           </w:tcPr>
           <w:p>
             <w:r>
@@ -2761,7 +2712,7 @@
         </w:tc>
         <w:tc>
           <w:tcPr>
-            <w:tcW w:type="dxa" w:w="1389"/>
+            <w:tcW w:w="1389" w:type="dxa"/>
           </w:tcPr>
           <w:p>
             <w:r>
@@ -2771,7 +2722,7 @@
         </w:tc>
         <w:tc>
           <w:tcPr>
-            <w:tcW w:type="dxa" w:w="1389"/>
+            <w:tcW w:w="1389" w:type="dxa"/>
           </w:tcPr>
           <w:p>
             <w:r>
@@ -2781,11 +2732,13 @@
         </w:tc>
         <w:tc>
           <w:tcPr>
-            <w:tcW w:type="dxa" w:w="1389"/>
+            <w:tcW w:w="1389" w:type="dxa"/>
           </w:tcPr>
           <w:p>
             <w:r>
               <w:t>1. POST /api/save with session_id and course payload.</w:t>
+            </w:r>
+            <w:r>
               <w:br/>
               <w:t>2. Query /api/history.</w:t>
             </w:r>
@@ -2793,7 +2746,7 @@
         </w:tc>
         <w:tc>
           <w:tcPr>
-            <w:tcW w:type="dxa" w:w="1389"/>
+            <w:tcW w:w="1389" w:type="dxa"/>
           </w:tcPr>
           <w:p>
             <w:r>
@@ -2803,7 +2756,7 @@
         </w:tc>
         <w:tc>
           <w:tcPr>
-            <w:tcW w:type="dxa" w:w="1389"/>
+            <w:tcW w:w="1389" w:type="dxa"/>
           </w:tcPr>
           <w:p>
             <w:r>
@@ -2815,17 +2768,18 @@
       <w:tr>
         <w:tc>
           <w:tcPr>
-            <w:tcW w:type="dxa" w:w="1389"/>
-          </w:tcPr>
-          <w:p>
-            <w:r>
+            <w:tcW w:w="1389" w:type="dxa"/>
+          </w:tcPr>
+          <w:p>
+            <w:r>
+              <w:lastRenderedPageBreak/>
               <w:t>TC-04</w:t>
             </w:r>
           </w:p>
         </w:tc>
         <w:tc>
           <w:tcPr>
-            <w:tcW w:type="dxa" w:w="1389"/>
+            <w:tcW w:w="1389" w:type="dxa"/>
           </w:tcPr>
           <w:p>
             <w:r>
@@ -2835,7 +2789,7 @@
         </w:tc>
         <w:tc>
           <w:tcPr>
-            <w:tcW w:type="dxa" w:w="1389"/>
+            <w:tcW w:w="1389" w:type="dxa"/>
           </w:tcPr>
           <w:p>
             <w:r>
@@ -2845,7 +2799,7 @@
         </w:tc>
         <w:tc>
           <w:tcPr>
-            <w:tcW w:type="dxa" w:w="1389"/>
+            <w:tcW w:w="1389" w:type="dxa"/>
           </w:tcPr>
           <w:p>
             <w:r>
@@ -2855,13 +2809,17 @@
         </w:tc>
         <w:tc>
           <w:tcPr>
-            <w:tcW w:type="dxa" w:w="1389"/>
+            <w:tcW w:w="1389" w:type="dxa"/>
           </w:tcPr>
           <w:p>
             <w:r>
               <w:t>1. Run scripts/build_models.py.</w:t>
+            </w:r>
+            <w:r>
               <w:br/>
               <w:t>2. Call RecommendationService.reload().</w:t>
+            </w:r>
+            <w:r>
               <w:br/>
               <w:t>3. Issue /api/recommend request.</w:t>
             </w:r>
@@ -2869,7 +2827,7 @@
         </w:tc>
         <w:tc>
           <w:tcPr>
-            <w:tcW w:type="dxa" w:w="1389"/>
+            <w:tcW w:w="1389" w:type="dxa"/>
           </w:tcPr>
           <w:p>
             <w:r>
@@ -2879,7 +2837,223 @@
         </w:tc>
         <w:tc>
           <w:tcPr>
-            <w:tcW w:type="dxa" w:w="1389"/>
+            <w:tcW w:w="1389" w:type="dxa"/>
+          </w:tcPr>
+          <w:p>
+            <w:r>
+              <w:t>Planned</w:t>
+            </w:r>
+          </w:p>
+        </w:tc>
+      </w:tr>
+      <w:tr>
+        <w:tc>
+          <w:tcPr>
+            <w:tcW w:w="1389" w:type="dxa"/>
+          </w:tcPr>
+          <w:p>
+            <w:r>
+              <w:t>TC-05</w:t>
+            </w:r>
+          </w:p>
+        </w:tc>
+        <w:tc>
+          <w:tcPr>
+            <w:tcW w:w="1389" w:type="dxa"/>
+          </w:tcPr>
+          <w:p>
+            <w:r>
+              <w:t>UC-02</w:t>
+            </w:r>
+          </w:p>
+        </w:tc>
+        <w:tc>
+          <w:tcPr>
+            <w:tcW w:w="1389" w:type="dxa"/>
+          </w:tcPr>
+          <w:p>
+            <w:r>
+              <w:t>Compare TF-IDF and neural results in the UI.</w:t>
+            </w:r>
+          </w:p>
+        </w:tc>
+        <w:tc>
+          <w:tcPr>
+            <w:tcW w:w="1389" w:type="dxa"/>
+          </w:tcPr>
+          <w:p>
+            <w:r>
+              <w:t>Valid recommendation results exist for a session.</w:t>
+            </w:r>
+          </w:p>
+        </w:tc>
+        <w:tc>
+          <w:tcPr>
+            <w:tcW w:w="1389" w:type="dxa"/>
+          </w:tcPr>
+          <w:p>
+            <w:r>
+              <w:t>1. Submit a preference with model=hybrid. 2. Open the comparison view for the session.</w:t>
+            </w:r>
+          </w:p>
+        </w:tc>
+        <w:tc>
+          <w:tcPr>
+            <w:tcW w:w="1389" w:type="dxa"/>
+          </w:tcPr>
+          <w:p>
+            <w:r>
+              <w:t>Side-by-side lists render with scores and consistent course metadata.</w:t>
+            </w:r>
+          </w:p>
+        </w:tc>
+        <w:tc>
+          <w:tcPr>
+            <w:tcW w:w="1389" w:type="dxa"/>
+          </w:tcPr>
+          <w:p>
+            <w:r>
+              <w:t>Planned</w:t>
+            </w:r>
+          </w:p>
+        </w:tc>
+      </w:tr>
+      <w:tr>
+        <w:tc>
+          <w:tcPr>
+            <w:tcW w:w="1389" w:type="dxa"/>
+          </w:tcPr>
+          <w:p>
+            <w:r>
+              <w:t>TC-06</w:t>
+            </w:r>
+          </w:p>
+        </w:tc>
+        <w:tc>
+          <w:tcPr>
+            <w:tcW w:w="1389" w:type="dxa"/>
+          </w:tcPr>
+          <w:p>
+            <w:r>
+              <w:t>UC-04</w:t>
+            </w:r>
+          </w:p>
+        </w:tc>
+        <w:tc>
+          <w:tcPr>
+            <w:tcW w:w="1389" w:type="dxa"/>
+          </w:tcPr>
+          <w:p>
+            <w:r>
+              <w:t>Review and replay a prior search.</w:t>
+            </w:r>
+          </w:p>
+        </w:tc>
+        <w:tc>
+          <w:tcPr>
+            <w:tcW w:w="1389" w:type="dxa"/>
+          </w:tcPr>
+          <w:p>
+            <w:r>
+              <w:t>At least one SearchSession exists.</w:t>
+            </w:r>
+          </w:p>
+        </w:tc>
+        <w:tc>
+          <w:tcPr>
+            <w:tcW w:w="1389" w:type="dxa"/>
+          </w:tcPr>
+          <w:p>
+            <w:r>
+              <w:t>1. GET /api/history. 2. Select a session and replay the query.</w:t>
+            </w:r>
+          </w:p>
+        </w:tc>
+        <w:tc>
+          <w:tcPr>
+            <w:tcW w:w="1389" w:type="dxa"/>
+          </w:tcPr>
+          <w:p>
+            <w:r>
+              <w:t>History returns sessions; replay returns a new recommendation response and logs a new session.</w:t>
+            </w:r>
+          </w:p>
+        </w:tc>
+        <w:tc>
+          <w:tcPr>
+            <w:tcW w:w="1389" w:type="dxa"/>
+          </w:tcPr>
+          <w:p>
+            <w:r>
+              <w:t>Planned</w:t>
+            </w:r>
+          </w:p>
+        </w:tc>
+      </w:tr>
+      <w:tr>
+        <w:tc>
+          <w:tcPr>
+            <w:tcW w:w="1389" w:type="dxa"/>
+          </w:tcPr>
+          <w:p>
+            <w:r>
+              <w:t>TC-07</w:t>
+            </w:r>
+          </w:p>
+        </w:tc>
+        <w:tc>
+          <w:tcPr>
+            <w:tcW w:w="1389" w:type="dxa"/>
+          </w:tcPr>
+          <w:p>
+            <w:r>
+              <w:t>UC-06</w:t>
+            </w:r>
+          </w:p>
+        </w:tc>
+        <w:tc>
+          <w:tcPr>
+            <w:tcW w:w="1389" w:type="dxa"/>
+          </w:tcPr>
+          <w:p>
+            <w:r>
+              <w:t>Run model evaluation and generate metrics.</w:t>
+            </w:r>
+          </w:p>
+        </w:tc>
+        <w:tc>
+          <w:tcPr>
+            <w:tcW w:w="1389" w:type="dxa"/>
+          </w:tcPr>
+          <w:p>
+            <w:r>
+              <w:t>Trained models and evaluation dataset are available.</w:t>
+            </w:r>
+          </w:p>
+        </w:tc>
+        <w:tc>
+          <w:tcPr>
+            <w:tcW w:w="1389" w:type="dxa"/>
+          </w:tcPr>
+          <w:p>
+            <w:r>
+              <w:t>1. Run evaluation tooling. 2. Inspect the generated report.</w:t>
+            </w:r>
+          </w:p>
+        </w:tc>
+        <w:tc>
+          <w:tcPr>
+            <w:tcW w:w="1389" w:type="dxa"/>
+          </w:tcPr>
+          <w:p>
+            <w:r>
+              <w:t>Precision@k and recall@k are reported and stored for stakeholders.</w:t>
+            </w:r>
+          </w:p>
+        </w:tc>
+        <w:tc>
+          <w:tcPr>
+            <w:tcW w:w="1389" w:type="dxa"/>
           </w:tcPr>
           <w:p>
             <w:r>
@@ -2911,7 +3085,7 @@
 </file>
 
 <file path=word/numbering.xml><?xml version="1.0" encoding="utf-8"?>
-<w:numbering xmlns:wpc="http://schemas.microsoft.com/office/word/2010/wordprocessingCanvas" xmlns:cx="http://schemas.microsoft.com/office/drawing/2014/chartex" xmlns:cx1="http://schemas.microsoft.com/office/drawing/2015/9/8/chartex" xmlns:cx2="http://schemas.microsoft.com/office/drawing/2015/10/21/chartex" xmlns:cx3="http://schemas.microsoft.com/office/drawing/2016/5/9/chartex" xmlns:cx4="http://schemas.microsoft.com/office/drawing/2016/5/10/chartex" xmlns:cx5="http://schemas.microsoft.com/office/drawing/2016/5/11/chartex" xmlns:cx6="http://schemas.microsoft.com/office/drawing/2016/5/12/chartex" xmlns:cx7="http://schemas.microsoft.com/office/drawing/2016/5/13/chartex" xmlns:cx8="http://schemas.microsoft.com/office/drawing/2016/5/14/chartex" xmlns:mc="http://schemas.openxmlformats.org/markup-compatibility/2006" xmlns:aink="http://schemas.microsoft.com/office/drawing/2016/ink" xmlns:am3d="http://schemas.microsoft.com/office/drawing/2017/model3d" xmlns:o="urn:schemas-microsoft-com:office:office" xmlns:r="http://schemas.openxmlformats.org/officeDocument/2006/relationships" xmlns:m="http://schemas.openxmlformats.org/officeDocument/2006/math" xmlns:v="urn:schemas-microsoft-com:vml" xmlns:wp14="http://schemas.microsoft.com/office/word/2010/wordprocessingDrawing" xmlns:wp="http://schemas.openxmlformats.org/drawingml/2006/wordprocessingDrawing" xmlns:w10="urn:schemas-microsoft-com:office:word" xmlns:w="http://schemas.openxmlformats.org/wordprocessingml/2006/main" xmlns:w14="http://schemas.microsoft.com/office/word/2010/wordml" xmlns:w15="http://schemas.microsoft.com/office/word/2012/wordml" xmlns:w16cex="http://schemas.microsoft.com/office/word/2018/wordml/cex" xmlns:w16cid="http://schemas.microsoft.com/office/word/2016/wordml/cid" xmlns:w16="http://schemas.microsoft.com/office/word/2018/wordml" xmlns:w16se="http://schemas.microsoft.com/office/word/2015/wordml/symex" xmlns:wpg="http://schemas.microsoft.com/office/word/2010/wordprocessingGroup" xmlns:wpi="http://schemas.microsoft.com/office/word/2010/wordprocessingInk" xmlns:wne="http://schemas.microsoft.com/office/word/2006/wordml" xmlns:wps="http://schemas.microsoft.com/office/word/2010/wordprocessingShape" mc:Ignorable="w14 w15 w16se w16cid w16 w16cex wp14">
+<w:numbering xmlns:wpc="http://schemas.microsoft.com/office/word/2010/wordprocessingCanvas" xmlns:cx="http://schemas.microsoft.com/office/drawing/2014/chartex" xmlns:cx1="http://schemas.microsoft.com/office/drawing/2015/9/8/chartex" xmlns:cx2="http://schemas.microsoft.com/office/drawing/2015/10/21/chartex" xmlns:cx3="http://schemas.microsoft.com/office/drawing/2016/5/9/chartex" xmlns:cx4="http://schemas.microsoft.com/office/drawing/2016/5/10/chartex" xmlns:cx5="http://schemas.microsoft.com/office/drawing/2016/5/11/chartex" xmlns:cx6="http://schemas.microsoft.com/office/drawing/2016/5/12/chartex" xmlns:cx7="http://schemas.microsoft.com/office/drawing/2016/5/13/chartex" xmlns:cx8="http://schemas.microsoft.com/office/drawing/2016/5/14/chartex" xmlns:mc="http://schemas.openxmlformats.org/markup-compatibility/2006" xmlns:aink="http://schemas.microsoft.com/office/drawing/2016/ink" xmlns:am3d="http://schemas.microsoft.com/office/drawing/2017/model3d" xmlns:o="urn:schemas-microsoft-com:office:office" xmlns:r="http://schemas.openxmlformats.org/officeDocument/2006/relationships" xmlns:m="http://schemas.openxmlformats.org/officeDocument/2006/math" xmlns:v="urn:schemas-microsoft-com:vml" xmlns:wp14="http://schemas.microsoft.com/office/word/2010/wordprocessingDrawing" xmlns:wp="http://schemas.openxmlformats.org/drawingml/2006/wordprocessingDrawing" xmlns:w10="urn:schemas-microsoft-com:office:word" xmlns:w="http://schemas.openxmlformats.org/wordprocessingml/2006/main" xmlns:w14="http://schemas.microsoft.com/office/word/2010/wordml" xmlns:w15="http://schemas.microsoft.com/office/word/2012/wordml" xmlns:w16cex="http://schemas.microsoft.com/office/word/2018/wordml/cex" xmlns:w16cid="http://schemas.microsoft.com/office/word/2016/wordml/cid" xmlns:w16="http://schemas.microsoft.com/office/word/2018/wordml" xmlns:w16sdtdh="http://schemas.microsoft.com/office/word/2020/wordml/sdtdatahash" xmlns:w16se="http://schemas.microsoft.com/office/word/2015/wordml/symex" xmlns:wpg="http://schemas.microsoft.com/office/word/2010/wordprocessingGroup" xmlns:wpi="http://schemas.microsoft.com/office/word/2010/wordprocessingInk" xmlns:wne="http://schemas.microsoft.com/office/word/2006/wordml" xmlns:wps="http://schemas.microsoft.com/office/word/2010/wordprocessingShape" mc:Ignorable="w14 w15 w16se w16cid w16 w16cex w16sdtdh wp14">
   <w:abstractNum w:abstractNumId="0" w15:restartNumberingAfterBreak="0">
     <w:nsid w:val="01913665"/>
     <w:multiLevelType w:val="hybridMultilevel"/>
@@ -4104,7 +4278,7 @@
 </file>
 
 <file path=word/styles.xml><?xml version="1.0" encoding="utf-8"?>
-<w:styles xmlns:mc="http://schemas.openxmlformats.org/markup-compatibility/2006" xmlns:r="http://schemas.openxmlformats.org/officeDocument/2006/relationships" xmlns:w="http://schemas.openxmlformats.org/wordprocessingml/2006/main" xmlns:w14="http://schemas.microsoft.com/office/word/2010/wordml" xmlns:w15="http://schemas.microsoft.com/office/word/2012/wordml" xmlns:w16cex="http://schemas.microsoft.com/office/word/2018/wordml/cex" xmlns:w16cid="http://schemas.microsoft.com/office/word/2016/wordml/cid" xmlns:w16="http://schemas.microsoft.com/office/word/2018/wordml" xmlns:w16se="http://schemas.microsoft.com/office/word/2015/wordml/symex" mc:Ignorable="w14 w15 w16se w16cid w16 w16cex">
+<w:styles xmlns:mc="http://schemas.openxmlformats.org/markup-compatibility/2006" xmlns:r="http://schemas.openxmlformats.org/officeDocument/2006/relationships" xmlns:w="http://schemas.openxmlformats.org/wordprocessingml/2006/main" xmlns:w14="http://schemas.microsoft.com/office/word/2010/wordml" xmlns:w15="http://schemas.microsoft.com/office/word/2012/wordml" xmlns:w16cex="http://schemas.microsoft.com/office/word/2018/wordml/cex" xmlns:w16cid="http://schemas.microsoft.com/office/word/2016/wordml/cid" xmlns:w16="http://schemas.microsoft.com/office/word/2018/wordml" xmlns:w16sdtdh="http://schemas.microsoft.com/office/word/2020/wordml/sdtdatahash" xmlns:w16se="http://schemas.microsoft.com/office/word/2015/wordml/symex" mc:Ignorable="w14 w15 w16se w16cid w16 w16cex w16sdtdh">
   <w:docDefaults>
     <w:rPrDefault>
       <w:rPr>
@@ -4130,6 +4304,50 @@
     <w:lsdException w:name="Subtitle" w:qFormat="1"/>
     <w:lsdException w:name="Strong" w:qFormat="1"/>
     <w:lsdException w:name="Emphasis" w:qFormat="1"/>
+    <w:lsdException w:name="Normal Table" w:semiHidden="1" w:unhideWhenUsed="1"/>
+    <w:lsdException w:name="Table Simple 1" w:semiHidden="1" w:unhideWhenUsed="1"/>
+    <w:lsdException w:name="Table Simple 2" w:semiHidden="1" w:unhideWhenUsed="1"/>
+    <w:lsdException w:name="Table Simple 3" w:semiHidden="1" w:unhideWhenUsed="1"/>
+    <w:lsdException w:name="Table Classic 1" w:semiHidden="1" w:unhideWhenUsed="1"/>
+    <w:lsdException w:name="Table Classic 2" w:semiHidden="1" w:unhideWhenUsed="1"/>
+    <w:lsdException w:name="Table Classic 3" w:semiHidden="1" w:unhideWhenUsed="1"/>
+    <w:lsdException w:name="Table Classic 4" w:semiHidden="1" w:unhideWhenUsed="1"/>
+    <w:lsdException w:name="Table Colorful 1" w:semiHidden="1" w:unhideWhenUsed="1"/>
+    <w:lsdException w:name="Table Colorful 2" w:semiHidden="1" w:unhideWhenUsed="1"/>
+    <w:lsdException w:name="Table Colorful 3" w:semiHidden="1" w:unhideWhenUsed="1"/>
+    <w:lsdException w:name="Table Columns 1" w:semiHidden="1" w:unhideWhenUsed="1"/>
+    <w:lsdException w:name="Table Columns 2" w:semiHidden="1" w:unhideWhenUsed="1"/>
+    <w:lsdException w:name="Table Columns 3" w:semiHidden="1" w:unhideWhenUsed="1"/>
+    <w:lsdException w:name="Table Columns 4" w:semiHidden="1" w:unhideWhenUsed="1"/>
+    <w:lsdException w:name="Table Columns 5" w:semiHidden="1" w:unhideWhenUsed="1"/>
+    <w:lsdException w:name="Table Grid 1" w:semiHidden="1" w:unhideWhenUsed="1"/>
+    <w:lsdException w:name="Table Grid 2" w:semiHidden="1" w:unhideWhenUsed="1"/>
+    <w:lsdException w:name="Table Grid 3" w:semiHidden="1" w:unhideWhenUsed="1"/>
+    <w:lsdException w:name="Table Grid 4" w:semiHidden="1" w:unhideWhenUsed="1"/>
+    <w:lsdException w:name="Table Grid 5" w:semiHidden="1" w:unhideWhenUsed="1"/>
+    <w:lsdException w:name="Table Grid 6" w:semiHidden="1" w:unhideWhenUsed="1"/>
+    <w:lsdException w:name="Table Grid 7" w:semiHidden="1" w:unhideWhenUsed="1"/>
+    <w:lsdException w:name="Table Grid 8" w:semiHidden="1" w:unhideWhenUsed="1"/>
+    <w:lsdException w:name="Table List 1" w:semiHidden="1" w:unhideWhenUsed="1"/>
+    <w:lsdException w:name="Table List 2" w:semiHidden="1" w:unhideWhenUsed="1"/>
+    <w:lsdException w:name="Table List 3" w:semiHidden="1" w:unhideWhenUsed="1"/>
+    <w:lsdException w:name="Table List 4" w:semiHidden="1" w:unhideWhenUsed="1"/>
+    <w:lsdException w:name="Table List 5" w:semiHidden="1" w:unhideWhenUsed="1"/>
+    <w:lsdException w:name="Table List 6" w:semiHidden="1" w:unhideWhenUsed="1"/>
+    <w:lsdException w:name="Table List 7" w:semiHidden="1" w:unhideWhenUsed="1"/>
+    <w:lsdException w:name="Table List 8" w:semiHidden="1" w:unhideWhenUsed="1"/>
+    <w:lsdException w:name="Table 3D effects 1" w:semiHidden="1" w:unhideWhenUsed="1"/>
+    <w:lsdException w:name="Table 3D effects 2" w:semiHidden="1" w:unhideWhenUsed="1"/>
+    <w:lsdException w:name="Table 3D effects 3" w:semiHidden="1" w:unhideWhenUsed="1"/>
+    <w:lsdException w:name="Table Contemporary" w:semiHidden="1" w:unhideWhenUsed="1"/>
+    <w:lsdException w:name="Table Elegant" w:semiHidden="1" w:unhideWhenUsed="1"/>
+    <w:lsdException w:name="Table Professional" w:semiHidden="1" w:unhideWhenUsed="1"/>
+    <w:lsdException w:name="Table Subtle 1" w:semiHidden="1" w:unhideWhenUsed="1"/>
+    <w:lsdException w:name="Table Subtle 2" w:semiHidden="1" w:unhideWhenUsed="1"/>
+    <w:lsdException w:name="Table Web 1" w:semiHidden="1" w:unhideWhenUsed="1"/>
+    <w:lsdException w:name="Table Web 2" w:semiHidden="1" w:unhideWhenUsed="1"/>
+    <w:lsdException w:name="Table Web 3" w:semiHidden="1" w:unhideWhenUsed="1"/>
+    <w:lsdException w:name="Table Theme" w:semiHidden="1" w:unhideWhenUsed="1"/>
     <w:lsdException w:name="Placeholder Text" w:semiHidden="1" w:uiPriority="99"/>
     <w:lsdException w:name="No Spacing" w:uiPriority="1" w:qFormat="1"/>
     <w:lsdException w:name="Light Shading" w:uiPriority="60"/>
@@ -4363,11 +4581,15 @@
   </w:style>
   <w:style w:type="character" w:default="1" w:styleId="DefaultParagraphFont">
     <w:name w:val="Default Paragraph Font"/>
+    <w:uiPriority w:val="1"/>
     <w:semiHidden/>
+    <w:unhideWhenUsed/>
   </w:style>
   <w:style w:type="table" w:default="1" w:styleId="TableNormal">
     <w:name w:val="Normal Table"/>
+    <w:uiPriority w:val="99"/>
     <w:semiHidden/>
+    <w:unhideWhenUsed/>
     <w:tblPr>
       <w:tblInd w:w="0" w:type="dxa"/>
       <w:tblCellMar>
@@ -4380,7 +4602,9 @@
   </w:style>
   <w:style w:type="numbering" w:default="1" w:styleId="NoList">
     <w:name w:val="No List"/>
+    <w:uiPriority w:val="99"/>
     <w:semiHidden/>
+    <w:unhideWhenUsed/>
   </w:style>
   <w:style w:type="paragraph" w:styleId="Title">
     <w:name w:val="Title"/>

</xml_diff>